<commit_message>
feat(dvr): tempi per metro lineare di avanzamento in tutti i DVR
Come nei DVR Castagnola (scavo tradizionale): nella sezione del ciclo di
lavoro si inseriscono la durata media delle fasi per metro con
esplosivo e con martellone e i metri scavati nel periodo; tutti i DVR
riportano dopo il ciclo la tabella con il totale per metro e i metri al
giorno. Dati in contenuti.avanzamento, blocco {#conAvanzamento} aggiunto
a tutti i 14 template da tools/dvr/avanzamento.py (idempotente, chiamato
da ogni costruttore); template rigenerati dai modelli e verificati
identici a prima tolto il blocco.

Co-Authored-By: Claude Opus 5.5 <noreply@anthropic.com>
Claude-Session: https://claude.ai/code/session_01UFrHEpZ45TUB6Ew485d3AX
</commit_message>
<xml_diff>
--- a/public/templates/dvr/acqua.docx
+++ b/public/templates/dvr/acqua.docx
@@ -3057,6 +3057,406 @@
       </w:pPr>
       <w:r>
         <w:t>{/cicloBlocchi}</w:t>
+      </w:r>
+    </w:p>
+    <w:p>
+      <w:pPr>
+        <w:pStyle w:val="Corpotesto1"/>
+      </w:pPr>
+      <w:r>
+        <w:t>{#conAvanzamento}</w:t>
+      </w:r>
+    </w:p>
+    <w:p>
+      <w:pPr>
+        <w:pStyle w:val="Corpotesto1"/>
+      </w:pPr>
+      <w:r>
+        <w:t xml:space="preserve">{avanzamentoTesto}</w:t>
+      </w:r>
+      <w:r>
+        <w:t xml:space="preserve"/>
+      </w:r>
+      <w:r>
+        <w:t/>
+      </w:r>
+      <w:r>
+        <w:t/>
+      </w:r>
+      <w:r>
+        <w:t/>
+      </w:r>
+      <w:r>
+        <w:t xml:space="preserve"/>
+      </w:r>
+      <w:r>
+        <w:t/>
+      </w:r>
+      <w:r>
+        <w:t xml:space="preserve"/>
+      </w:r>
+      <w:r>
+        <w:t xml:space="preserve"/>
+      </w:r>
+      <w:r>
+        <w:t/>
+      </w:r>
+    </w:p>
+    <w:p>
+      <w:pPr>
+        <w:pStyle w:val="Didascalia"/>
+        <w:keepNext/>
+        <w:jc w:val="both"/>
+        <w:rPr>
+          <w:sz w:val="16"/>
+          <w:szCs w:val="16"/>
+        </w:rPr>
+      </w:pPr>
+      <w:r>
+        <w:rPr>
+          <w:sz w:val="16"/>
+          <w:szCs w:val="16"/>
+        </w:rPr>
+        <w:t xml:space="preserve">Tabella </w:t>
+      </w:r>
+      <w:fldSimple w:instr=" SEQ Tabella \* ARABIC ">
+        <w:r>
+          <w:rPr>
+            <w:sz w:val="16"/>
+            <w:szCs w:val="16"/>
+          </w:rPr>
+          <w:t xml:space="preserve">1</w:t>
+        </w:r>
+      </w:fldSimple>
+      <w:r>
+        <w:rPr>
+          <w:sz w:val="16"/>
+          <w:szCs w:val="16"/>
+        </w:rPr>
+        <w:t xml:space="preserve">. Tempi medi delle operazioni per metro lineare di avanzamento</w:t>
+      </w:r>
+    </w:p>
+    <w:tbl>
+      <w:tblPr>
+        <w:tblW w:w="5186" w:type="pct"/>
+        <w:jc w:val="center"/>
+        <w:tblBorders>
+          <w:top w:val="single" w:sz="4" w:space="0" w:color="auto"/>
+          <w:left w:val="single" w:sz="4" w:space="0" w:color="auto"/>
+          <w:bottom w:val="single" w:sz="4" w:space="0" w:color="auto"/>
+          <w:right w:val="single" w:sz="4" w:space="0" w:color="auto"/>
+          <w:insideH w:val="single" w:sz="4" w:space="0" w:color="auto"/>
+          <w:insideV w:val="single" w:sz="4" w:space="0" w:color="auto"/>
+        </w:tblBorders>
+        <w:tblCellMar>
+          <w:left w:w="70" w:type="dxa"/>
+          <w:right w:w="70" w:type="dxa"/>
+        </w:tblCellMar>
+        <w:tblLook w:val="0000" w:firstRow="0" w:lastRow="0" w:firstColumn="0" w:lastColumn="0" w:noHBand="0" w:noVBand="0"/>
+      </w:tblPr>
+      <w:tblGrid>
+        <w:gridCol w:w="3876"/>
+        <w:gridCol w:w="2907"/>
+        <w:gridCol w:w="2907"/>
+      </w:tblGrid>
+      <w:tr>
+        <w:trPr>
+          <w:cantSplit/>
+          <w:trHeight w:val="474"/>
+          <w:jc w:val="center"/>
+          <w:tblHeader/>
+        </w:trPr>
+        <w:tc>
+          <w:tcPr>
+            <w:tcW w:w="3876" w:type="dxa"/>
+            <w:shd w:val="clear" w:color="auto" w:fill="E7E6E6"/>
+            <w:vAlign w:val="center"/>
+          </w:tcPr>
+          <w:p>
+            <w:pPr>
+              <w:keepNext/>
+              <w:numPr>
+                <w:ilvl w:val="12"/>
+                <w:numId w:val="0"/>
+              </w:numPr>
+              <w:spacing w:after="0" w:line="200" w:lineRule="exact"/>
+              <w:jc w:val="center"/>
+              <w:rPr>
+                <w:b/>
+                <w:sz w:val="16"/>
+                <w:szCs w:val="16"/>
+              </w:rPr>
+            </w:pPr>
+            <w:r>
+              <w:rPr>
+                <w:b/>
+                <w:sz w:val="16"/>
+                <w:szCs w:val="16"/>
+              </w:rPr>
+              <w:t xml:space="preserve">Fase lavorativa</w:t>
+            </w:r>
+          </w:p>
+        </w:tc>
+        <w:tc>
+          <w:tcPr>
+            <w:tcW w:w="2907" w:type="dxa"/>
+            <w:shd w:val="clear" w:color="auto" w:fill="E7E6E6"/>
+            <w:vAlign w:val="center"/>
+          </w:tcPr>
+          <w:p>
+            <w:pPr>
+              <w:keepNext/>
+              <w:numPr>
+                <w:ilvl w:val="12"/>
+                <w:numId w:val="0"/>
+              </w:numPr>
+              <w:spacing w:after="0" w:line="200" w:lineRule="exact"/>
+              <w:jc w:val="center"/>
+              <w:rPr>
+                <w:b/>
+                <w:sz w:val="16"/>
+                <w:szCs w:val="16"/>
+              </w:rPr>
+            </w:pPr>
+            <w:r>
+              <w:rPr>
+                <w:b/>
+                <w:sz w:val="16"/>
+                <w:szCs w:val="16"/>
+              </w:rPr>
+              <w:t xml:space="preserve">Avanzamento con esplosivo – tempi per metro lineare (min)</w:t>
+            </w:r>
+          </w:p>
+        </w:tc>
+        <w:tc>
+          <w:tcPr>
+            <w:tcW w:w="2907" w:type="dxa"/>
+            <w:shd w:val="clear" w:color="auto" w:fill="E7E6E6"/>
+            <w:vAlign w:val="center"/>
+          </w:tcPr>
+          <w:p>
+            <w:pPr>
+              <w:keepNext/>
+              <w:numPr>
+                <w:ilvl w:val="12"/>
+                <w:numId w:val="0"/>
+              </w:numPr>
+              <w:spacing w:after="0" w:line="200" w:lineRule="exact"/>
+              <w:jc w:val="center"/>
+              <w:rPr>
+                <w:b/>
+                <w:sz w:val="16"/>
+                <w:szCs w:val="16"/>
+              </w:rPr>
+            </w:pPr>
+            <w:r>
+              <w:rPr>
+                <w:b/>
+                <w:sz w:val="16"/>
+                <w:szCs w:val="16"/>
+              </w:rPr>
+              <w:t xml:space="preserve">Avanzamento con martellone – tempi per metro lineare (min)</w:t>
+            </w:r>
+          </w:p>
+        </w:tc>
+      </w:tr>
+      <w:tr>
+        <w:trPr>
+          <w:cantSplit/>
+          <w:trHeight w:val="474"/>
+          <w:jc w:val="center"/>
+        </w:trPr>
+        <w:tc>
+          <w:tcPr>
+            <w:tcW w:w="3876" w:type="dxa"/>
+            <w:vAlign w:val="center"/>
+          </w:tcPr>
+          <w:p>
+            <w:pPr>
+              <w:numPr>
+                <w:ilvl w:val="12"/>
+                <w:numId w:val="0"/>
+              </w:numPr>
+              <w:spacing w:after="0" w:line="200" w:lineRule="exact"/>
+              <w:jc w:val="center"/>
+              <w:rPr>
+                <w:sz w:val="16"/>
+                <w:szCs w:val="16"/>
+              </w:rPr>
+            </w:pPr>
+            <w:r>
+              <w:rPr>
+                <w:sz w:val="16"/>
+                <w:szCs w:val="16"/>
+              </w:rPr>
+              <w:t xml:space="preserve">{#avanzamento}{fase}</w:t>
+            </w:r>
+          </w:p>
+        </w:tc>
+        <w:tc>
+          <w:tcPr>
+            <w:tcW w:w="2907" w:type="dxa"/>
+            <w:vAlign w:val="center"/>
+          </w:tcPr>
+          <w:p>
+            <w:pPr>
+              <w:numPr>
+                <w:ilvl w:val="12"/>
+                <w:numId w:val="0"/>
+              </w:numPr>
+              <w:spacing w:after="0" w:line="200" w:lineRule="exact"/>
+              <w:jc w:val="center"/>
+              <w:rPr>
+                <w:sz w:val="16"/>
+                <w:szCs w:val="16"/>
+              </w:rPr>
+            </w:pPr>
+            <w:r>
+              <w:rPr>
+                <w:sz w:val="16"/>
+                <w:szCs w:val="16"/>
+              </w:rPr>
+              <w:t xml:space="preserve">{esplosivo}</w:t>
+            </w:r>
+          </w:p>
+        </w:tc>
+        <w:tc>
+          <w:tcPr>
+            <w:tcW w:w="2907" w:type="dxa"/>
+            <w:vAlign w:val="center"/>
+          </w:tcPr>
+          <w:p>
+            <w:pPr>
+              <w:numPr>
+                <w:ilvl w:val="12"/>
+                <w:numId w:val="0"/>
+              </w:numPr>
+              <w:spacing w:after="0" w:line="200" w:lineRule="exact"/>
+              <w:jc w:val="center"/>
+              <w:rPr>
+                <w:sz w:val="16"/>
+                <w:szCs w:val="16"/>
+              </w:rPr>
+            </w:pPr>
+            <w:r>
+              <w:rPr>
+                <w:sz w:val="16"/>
+                <w:szCs w:val="16"/>
+              </w:rPr>
+              <w:t xml:space="preserve">{martellone}{/avanzamento}</w:t>
+            </w:r>
+          </w:p>
+        </w:tc>
+      </w:tr>
+    </w:tbl>
+    <w:p>
+      <w:pPr>
+        <w:pStyle w:val="Corpotesto1"/>
+      </w:pPr>
+      <w:r>
+        <w:t>{#conProduzione}</w:t>
+      </w:r>
+    </w:p>
+    <w:p>
+      <w:pPr>
+        <w:pStyle w:val="Corpotesto1"/>
+      </w:pPr>
+      <w:r>
+        <w:t xml:space="preserve">{produzioneTesto}</w:t>
+      </w:r>
+      <w:r>
+        <w:t xml:space="preserve"/>
+      </w:r>
+      <w:r>
+        <w:t/>
+      </w:r>
+      <w:r>
+        <w:t/>
+      </w:r>
+      <w:r>
+        <w:t/>
+      </w:r>
+      <w:r>
+        <w:t xml:space="preserve"/>
+      </w:r>
+      <w:r>
+        <w:t/>
+      </w:r>
+      <w:r>
+        <w:t xml:space="preserve"/>
+      </w:r>
+      <w:r>
+        <w:t xml:space="preserve"/>
+      </w:r>
+      <w:r>
+        <w:t/>
+      </w:r>
+    </w:p>
+    <w:p>
+      <w:pPr>
+        <w:pStyle w:val="Corpotesto1"/>
+      </w:pPr>
+      <w:r>
+        <w:t>{#produzione}</w:t>
+      </w:r>
+    </w:p>
+    <w:p>
+      <w:pPr>
+        <w:pStyle w:val="Corpotesto1"/>
+      </w:pPr>
+      <w:r>
+        <w:t xml:space="preserve">{.}</w:t>
+      </w:r>
+      <w:r>
+        <w:t xml:space="preserve"/>
+      </w:r>
+      <w:r>
+        <w:t/>
+      </w:r>
+      <w:r>
+        <w:t/>
+      </w:r>
+      <w:r>
+        <w:t/>
+      </w:r>
+      <w:r>
+        <w:t xml:space="preserve"/>
+      </w:r>
+      <w:r>
+        <w:t/>
+      </w:r>
+      <w:r>
+        <w:t xml:space="preserve"/>
+      </w:r>
+      <w:r>
+        <w:t xml:space="preserve"/>
+      </w:r>
+      <w:r>
+        <w:t/>
+      </w:r>
+    </w:p>
+    <w:p>
+      <w:pPr>
+        <w:pStyle w:val="Corpotesto1"/>
+      </w:pPr>
+      <w:r>
+        <w:t>{/produzione}</w:t>
+      </w:r>
+    </w:p>
+    <w:p>
+      <w:pPr>
+        <w:pStyle w:val="Corpotesto1"/>
+      </w:pPr>
+      <w:r>
+        <w:t>{/conProduzione}</w:t>
+      </w:r>
+    </w:p>
+    <w:p>
+      <w:pPr>
+        <w:pStyle w:val="Corpotesto1"/>
+      </w:pPr>
+      <w:r>
+        <w:t>{/conAvanzamento}</w:t>
       </w:r>
     </w:p>
     <w:p>

</xml_diff>